<commit_message>
chore: push latest documentation and project updates
</commit_message>
<xml_diff>
--- a/IPR Utility patent - Application Form.docx
+++ b/IPR Utility patent - Application Form.docx
@@ -43,7 +43,7 @@
         </w:pBdr>
         <w:spacing w:after="0" w:line="360" w:lineRule="auto"/>
         <w:ind w:left="360" w:hanging="360"/>
-        <w:jc w:val="center"/>
+        <w:jc w:val="both"/>
         <w:rPr>
           <w:rFonts w:hint="default" w:ascii="Times New Roman" w:hAnsi="Times New Roman" w:eastAsia="CMU Serif Roman" w:cs="Times New Roman"/>
           <w:color w:val="000000"/>
@@ -63,6 +63,8 @@
         </w:rPr>
         <w:t>Invention Disclosure Form - Product (Utility Patent)</w:t>
       </w:r>
+      <w:bookmarkStart w:id="2" w:name="_GoBack"/>
+      <w:bookmarkEnd w:id="2"/>
       <w:bookmarkStart w:id="1" w:name="_30j0zll" w:colFirst="0" w:colLast="0"/>
       <w:bookmarkEnd w:id="1"/>
       <w:r>
@@ -284,7 +286,6 @@
           <w:lang w:val="en-US"/>
         </w:rPr>
         <w:tab/>
-        <w:t/>
       </w:r>
       <w:r>
         <w:rPr>
@@ -294,7 +295,6 @@
           <w:lang w:val="en-US"/>
         </w:rPr>
         <w:tab/>
-        <w:t/>
       </w:r>
       <w:r>
         <w:rPr>
@@ -304,7 +304,6 @@
           <w:lang w:val="en-US"/>
         </w:rPr>
         <w:tab/>
-        <w:t/>
       </w:r>
       <w:r>
         <w:rPr>
@@ -314,6 +313,14 @@
           <w:lang w:val="en-US"/>
         </w:rPr>
         <w:tab/>
+      </w:r>
+      <w:r>
+        <w:rPr>
+          <w:rFonts w:hint="default" w:ascii="Times New Roman" w:hAnsi="Times New Roman" w:eastAsia="SimSun" w:cs="Times New Roman"/>
+          <w:sz w:val="20"/>
+          <w:szCs w:val="20"/>
+          <w:lang w:val="en-US"/>
+        </w:rPr>
         <w:t xml:space="preserve">  </w:t>
       </w:r>
       <w:r>
@@ -324,6 +331,14 @@
           <w:lang w:val="en-US"/>
         </w:rPr>
         <w:tab/>
+      </w:r>
+      <w:r>
+        <w:rPr>
+          <w:rFonts w:hint="default" w:ascii="Times New Roman" w:hAnsi="Times New Roman" w:eastAsia="SimSun" w:cs="Times New Roman"/>
+          <w:sz w:val="20"/>
+          <w:szCs w:val="20"/>
+          <w:lang w:val="en-US"/>
+        </w:rPr>
         <w:t xml:space="preserve">  </w:t>
       </w:r>
       <w:r>
@@ -339,7 +354,7 @@
       <w:pPr>
         <w:spacing w:line="276" w:lineRule="auto"/>
         <w:ind w:left="360"/>
-        <w:jc w:val="center"/>
+        <w:jc w:val="both"/>
         <w:rPr>
           <w:rFonts w:hint="default" w:ascii="Times New Roman" w:hAnsi="Times New Roman" w:eastAsia="CMU Serif Roman" w:cs="Times New Roman"/>
           <w:sz w:val="22"/>
@@ -406,7 +421,6 @@
           <w:lang w:val="en-US"/>
         </w:rPr>
         <w:tab/>
-        <w:t/>
       </w:r>
       <w:r>
         <w:rPr>
@@ -416,7 +430,6 @@
           <w:lang w:val="en-US"/>
         </w:rPr>
         <w:tab/>
-        <w:t/>
       </w:r>
       <w:r>
         <w:rPr>
@@ -426,7 +439,6 @@
           <w:lang w:val="en-US"/>
         </w:rPr>
         <w:tab/>
-        <w:t/>
       </w:r>
       <w:r>
         <w:rPr>
@@ -436,6 +448,14 @@
           <w:lang w:val="en-US"/>
         </w:rPr>
         <w:tab/>
+      </w:r>
+      <w:r>
+        <w:rPr>
+          <w:rFonts w:hint="default" w:ascii="Times New Roman" w:hAnsi="Times New Roman" w:eastAsia="SimSun" w:cs="Times New Roman"/>
+          <w:sz w:val="20"/>
+          <w:szCs w:val="20"/>
+          <w:lang w:val="en-US"/>
+        </w:rPr>
         <w:t xml:space="preserve"> </w:t>
       </w:r>
       <w:r>
@@ -446,6 +466,14 @@
           <w:lang w:val="en-US"/>
         </w:rPr>
         <w:tab/>
+      </w:r>
+      <w:r>
+        <w:rPr>
+          <w:rFonts w:hint="default" w:ascii="Times New Roman" w:hAnsi="Times New Roman" w:eastAsia="SimSun" w:cs="Times New Roman"/>
+          <w:sz w:val="20"/>
+          <w:szCs w:val="20"/>
+          <w:lang w:val="en-US"/>
+        </w:rPr>
         <w:t xml:space="preserve">  </w:t>
       </w:r>
       <w:r>
@@ -489,6 +517,7 @@
         </w:pBdr>
         <w:spacing w:after="0" w:line="276" w:lineRule="auto"/>
         <w:ind w:left="360"/>
+        <w:jc w:val="both"/>
         <w:rPr>
           <w:rFonts w:hint="default" w:ascii="Times New Roman" w:hAnsi="Times New Roman" w:eastAsia="CMU Serif Roman" w:cs="Times New Roman"/>
           <w:color w:val="000000"/>
@@ -526,6 +555,7 @@
           <w:between w:val="none" w:color="auto" w:sz="0" w:space="0"/>
         </w:pBdr>
         <w:spacing w:after="0" w:line="276" w:lineRule="auto"/>
+        <w:jc w:val="both"/>
         <w:rPr>
           <w:rFonts w:hint="default" w:ascii="Times New Roman" w:hAnsi="Times New Roman" w:eastAsia="CMU Serif Roman" w:cs="Times New Roman"/>
           <w:b/>
@@ -556,6 +586,7 @@
         <w:suppressLineNumbers w:val="0"/>
         <w:spacing w:before="0" w:beforeAutospacing="1" w:after="0" w:afterAutospacing="1"/>
         <w:ind w:left="0" w:right="0" w:firstLine="720" w:firstLineChars="0"/>
+        <w:jc w:val="both"/>
         <w:rPr>
           <w:rFonts w:hint="default" w:ascii="Times New Roman" w:hAnsi="Times New Roman" w:cs="Times New Roman"/>
           <w:sz w:val="20"/>
@@ -623,6 +654,7 @@
         <w:suppressLineNumbers w:val="0"/>
         <w:spacing w:before="0" w:beforeAutospacing="1" w:after="0" w:afterAutospacing="1"/>
         <w:ind w:left="0" w:right="0" w:firstLine="720" w:firstLineChars="0"/>
+        <w:jc w:val="both"/>
         <w:rPr>
           <w:rFonts w:hint="default" w:ascii="Times New Roman" w:hAnsi="Times New Roman" w:cs="Times New Roman"/>
           <w:sz w:val="20"/>
@@ -680,8 +712,6 @@
         </w:rPr>
         <w:t xml:space="preserve"> Inventor / Student</w:t>
       </w:r>
-      <w:bookmarkStart w:id="2" w:name="_GoBack"/>
-      <w:bookmarkEnd w:id="2"/>
     </w:p>
     <w:p>
       <w:pPr>
@@ -692,6 +722,7 @@
         <w:suppressLineNumbers w:val="0"/>
         <w:spacing w:before="0" w:beforeAutospacing="1" w:after="0" w:afterAutospacing="1"/>
         <w:ind w:left="0" w:right="0" w:firstLine="720" w:firstLineChars="0"/>
+        <w:jc w:val="both"/>
         <w:rPr>
           <w:rFonts w:hint="default" w:ascii="Times New Roman" w:hAnsi="Times New Roman" w:cs="Times New Roman"/>
           <w:sz w:val="20"/>
@@ -759,6 +790,7 @@
         <w:suppressLineNumbers w:val="0"/>
         <w:spacing w:before="0" w:beforeAutospacing="1" w:after="0" w:afterAutospacing="1"/>
         <w:ind w:left="0" w:right="0" w:firstLine="720" w:firstLineChars="0"/>
+        <w:jc w:val="both"/>
         <w:rPr>
           <w:rFonts w:hint="default" w:ascii="Times New Roman" w:hAnsi="Times New Roman" w:cs="Times New Roman"/>
           <w:sz w:val="20"/>
@@ -826,6 +858,7 @@
         <w:suppressLineNumbers w:val="0"/>
         <w:spacing w:before="0" w:beforeAutospacing="1" w:after="0" w:afterAutospacing="1"/>
         <w:ind w:right="0"/>
+        <w:jc w:val="both"/>
         <w:rPr>
           <w:rStyle w:val="14"/>
           <w:rFonts w:hint="default" w:ascii="Times New Roman" w:hAnsi="Times New Roman" w:cs="Times New Roman"/>
@@ -864,6 +897,7 @@
         <w:suppressLineNumbers w:val="0"/>
         <w:spacing w:before="0" w:beforeAutospacing="1" w:after="0" w:afterAutospacing="1"/>
         <w:ind w:left="0" w:right="0" w:firstLine="720" w:firstLineChars="0"/>
+        <w:jc w:val="both"/>
         <w:rPr>
           <w:rFonts w:hint="default" w:ascii="Times New Roman" w:hAnsi="Times New Roman" w:eastAsia="CMU Serif Roman" w:cs="Times New Roman"/>
           <w:b/>
@@ -917,6 +951,7 @@
           <w:between w:val="none" w:color="auto" w:sz="0" w:space="0"/>
         </w:pBdr>
         <w:spacing w:after="0" w:line="276" w:lineRule="auto"/>
+        <w:jc w:val="both"/>
         <w:rPr>
           <w:rFonts w:hint="default" w:ascii="Times New Roman" w:hAnsi="Times New Roman" w:eastAsia="CMU Serif Roman" w:cs="Times New Roman"/>
           <w:color w:val="000000"/>
@@ -1206,6 +1241,7 @@
         <w:suppressLineNumbers w:val="0"/>
         <w:spacing w:before="0" w:beforeAutospacing="1" w:after="0" w:afterAutospacing="1"/>
         <w:ind w:left="0" w:right="0"/>
+        <w:jc w:val="both"/>
         <w:rPr>
           <w:rFonts w:hint="default" w:ascii="Times New Roman" w:hAnsi="Times New Roman" w:cs="Times New Roman"/>
           <w:sz w:val="20"/>
@@ -1222,7 +1258,6 @@
           <w:lang w:val="en-US"/>
         </w:rPr>
         <w:tab/>
-        <w:t/>
       </w:r>
       <w:r>
         <w:rPr>
@@ -1234,7 +1269,6 @@
           <w:lang w:val="en-US"/>
         </w:rPr>
         <w:tab/>
-        <w:t/>
       </w:r>
       <w:r>
         <w:rPr>
@@ -1268,6 +1302,7 @@
         <w:suppressLineNumbers w:val="0"/>
         <w:spacing w:before="0" w:beforeAutospacing="1" w:after="0" w:afterAutospacing="1"/>
         <w:ind w:left="720" w:hanging="360"/>
+        <w:jc w:val="both"/>
         <w:rPr>
           <w:rFonts w:hint="default" w:ascii="Times New Roman" w:hAnsi="Times New Roman" w:cs="Times New Roman"/>
           <w:sz w:val="20"/>
@@ -1304,6 +1339,7 @@
         <w:suppressLineNumbers w:val="0"/>
         <w:spacing w:before="0" w:beforeAutospacing="1" w:after="0" w:afterAutospacing="1"/>
         <w:ind w:left="720" w:hanging="360"/>
+        <w:jc w:val="both"/>
         <w:rPr>
           <w:rFonts w:hint="default" w:ascii="Times New Roman" w:hAnsi="Times New Roman" w:cs="Times New Roman"/>
           <w:sz w:val="20"/>
@@ -1340,6 +1376,7 @@
         <w:suppressLineNumbers w:val="0"/>
         <w:spacing w:before="0" w:beforeAutospacing="1" w:after="0" w:afterAutospacing="1"/>
         <w:ind w:left="720" w:hanging="360"/>
+        <w:jc w:val="both"/>
         <w:rPr>
           <w:rFonts w:hint="default" w:ascii="Times New Roman" w:hAnsi="Times New Roman" w:cs="Times New Roman"/>
           <w:sz w:val="20"/>
@@ -1393,6 +1430,7 @@
         <w:suppressLineNumbers w:val="0"/>
         <w:spacing w:before="0" w:beforeAutospacing="1" w:after="0" w:afterAutospacing="1"/>
         <w:ind w:left="720" w:hanging="360"/>
+        <w:jc w:val="both"/>
         <w:rPr>
           <w:rFonts w:hint="default" w:ascii="Times New Roman" w:hAnsi="Times New Roman" w:cs="Times New Roman"/>
           <w:sz w:val="20"/>
@@ -1429,6 +1467,7 @@
         <w:suppressLineNumbers w:val="0"/>
         <w:spacing w:before="0" w:beforeAutospacing="1" w:after="0" w:afterAutospacing="1"/>
         <w:ind w:left="720" w:hanging="360"/>
+        <w:jc w:val="both"/>
         <w:rPr>
           <w:rFonts w:hint="default" w:ascii="Times New Roman" w:hAnsi="Times New Roman" w:eastAsia="CMU Serif Roman" w:cs="Times New Roman"/>
           <w:b/>
@@ -1465,6 +1504,7 @@
           <w:between w:val="none" w:color="auto" w:sz="0" w:space="0"/>
         </w:pBdr>
         <w:spacing w:after="0" w:line="276" w:lineRule="auto"/>
+        <w:jc w:val="both"/>
         <w:rPr>
           <w:rFonts w:hint="default" w:ascii="Times New Roman" w:hAnsi="Times New Roman" w:eastAsia="CMU Serif Roman" w:cs="Times New Roman"/>
           <w:b/>
@@ -1506,6 +1546,7 @@
           <w:between w:val="none" w:color="auto" w:sz="0" w:space="0"/>
         </w:pBdr>
         <w:spacing w:after="0" w:line="276" w:lineRule="auto"/>
+        <w:jc w:val="both"/>
         <w:rPr>
           <w:rFonts w:hint="default" w:ascii="Times New Roman" w:hAnsi="Times New Roman" w:eastAsia="CMU Serif Roman" w:cs="Times New Roman"/>
           <w:color w:val="000000"/>
@@ -1523,7 +1564,6 @@
           <w:lang w:val="en-US"/>
         </w:rPr>
         <w:tab/>
-        <w:t/>
       </w:r>
       <w:r>
         <w:rPr>
@@ -1554,6 +1594,7 @@
           <w:between w:val="none" w:color="auto" w:sz="0" w:space="0"/>
         </w:pBdr>
         <w:spacing w:after="0" w:line="276" w:lineRule="auto"/>
+        <w:jc w:val="both"/>
         <w:rPr>
           <w:rFonts w:hint="default" w:ascii="Times New Roman" w:hAnsi="Times New Roman" w:eastAsia="CMU Serif Roman" w:cs="Times New Roman"/>
           <w:color w:val="000000"/>
@@ -1572,6 +1613,7 @@
           <w:between w:val="none" w:color="auto" w:sz="0" w:space="0"/>
         </w:pBdr>
         <w:spacing w:after="0" w:line="276" w:lineRule="auto"/>
+        <w:jc w:val="both"/>
         <w:rPr>
           <w:rFonts w:hint="default" w:ascii="Times New Roman" w:hAnsi="Times New Roman" w:eastAsia="CMU Serif Roman" w:cs="Times New Roman"/>
           <w:b/>
@@ -1609,6 +1651,7 @@
         <w:keepLines w:val="0"/>
         <w:widowControl/>
         <w:suppressLineNumbers w:val="0"/>
+        <w:jc w:val="both"/>
         <w:rPr>
           <w:rFonts w:hint="default" w:ascii="Times New Roman" w:hAnsi="Times New Roman" w:cs="Times New Roman"/>
         </w:rPr>
@@ -1686,7 +1729,6 @@
           <w:lang w:val="en-US"/>
         </w:rPr>
         <w:tab/>
-        <w:t/>
       </w:r>
       <w:r>
         <w:rPr>
@@ -1713,7 +1755,6 @@
           <w:lang w:val="en-US"/>
         </w:rPr>
         <w:tab/>
-        <w:t/>
       </w:r>
       <w:r>
         <w:rPr>
@@ -1796,7 +1837,6 @@
           <w:lang w:val="en-US"/>
         </w:rPr>
         <w:tab/>
-        <w:t/>
       </w:r>
       <w:r>
         <w:rPr>
@@ -1806,7 +1846,6 @@
           <w:lang w:val="en-US"/>
         </w:rPr>
         <w:tab/>
-        <w:t/>
       </w:r>
       <w:r>
         <w:rPr>
@@ -1942,7 +1981,7 @@
     <w:p>
       <w:pPr>
         <w:spacing w:line="276" w:lineRule="auto"/>
-        <w:jc w:val="center"/>
+        <w:jc w:val="both"/>
         <w:rPr>
           <w:rFonts w:hint="default" w:ascii="Times New Roman" w:hAnsi="Times New Roman" w:cs="Times New Roman"/>
         </w:rPr>
@@ -1997,7 +2036,7 @@
     <w:p>
       <w:pPr>
         <w:spacing w:line="276" w:lineRule="auto"/>
-        <w:jc w:val="center"/>
+        <w:jc w:val="both"/>
         <w:rPr>
           <w:rFonts w:hint="default" w:ascii="Times New Roman" w:hAnsi="Times New Roman" w:cs="Times New Roman"/>
         </w:rPr>
@@ -2052,7 +2091,7 @@
     <w:p>
       <w:pPr>
         <w:spacing w:line="276" w:lineRule="auto"/>
-        <w:jc w:val="center"/>
+        <w:jc w:val="both"/>
         <w:rPr>
           <w:rFonts w:hint="default" w:ascii="Times New Roman" w:hAnsi="Times New Roman" w:cs="Times New Roman"/>
         </w:rPr>
@@ -2107,7 +2146,7 @@
     <w:p>
       <w:pPr>
         <w:spacing w:line="276" w:lineRule="auto"/>
-        <w:jc w:val="center"/>
+        <w:jc w:val="both"/>
         <w:rPr>
           <w:rFonts w:hint="default" w:ascii="Times New Roman" w:hAnsi="Times New Roman" w:cs="Times New Roman"/>
         </w:rPr>
@@ -2163,7 +2202,7 @@
     <w:p>
       <w:pPr>
         <w:spacing w:line="276" w:lineRule="auto"/>
-        <w:jc w:val="center"/>
+        <w:jc w:val="both"/>
         <w:rPr>
           <w:rFonts w:hint="default" w:ascii="Times New Roman" w:hAnsi="Times New Roman" w:cs="Times New Roman"/>
         </w:rPr>
@@ -2219,7 +2258,7 @@
     <w:p>
       <w:pPr>
         <w:spacing w:line="276" w:lineRule="auto"/>
-        <w:jc w:val="center"/>
+        <w:jc w:val="both"/>
         <w:rPr>
           <w:rFonts w:hint="default" w:ascii="Times New Roman" w:hAnsi="Times New Roman" w:cs="Times New Roman"/>
         </w:rPr>
@@ -2301,6 +2340,7 @@
         <w:suppressLineNumbers w:val="0"/>
         <w:spacing w:before="0" w:beforeAutospacing="1" w:after="0" w:afterAutospacing="1"/>
         <w:ind w:left="0" w:right="0"/>
+        <w:jc w:val="both"/>
         <w:rPr>
           <w:rFonts w:hint="default" w:ascii="Times New Roman" w:hAnsi="Times New Roman" w:cs="Times New Roman"/>
           <w:sz w:val="20"/>
@@ -2328,6 +2368,7 @@
         <w:suppressLineNumbers w:val="0"/>
         <w:spacing w:before="0" w:beforeAutospacing="1" w:after="0" w:afterAutospacing="1"/>
         <w:ind w:left="720" w:hanging="360"/>
+        <w:jc w:val="both"/>
         <w:rPr>
           <w:rFonts w:hint="default" w:ascii="Times New Roman" w:hAnsi="Times New Roman" w:cs="Times New Roman"/>
           <w:sz w:val="20"/>
@@ -2364,6 +2405,7 @@
         <w:suppressLineNumbers w:val="0"/>
         <w:spacing w:before="0" w:beforeAutospacing="1" w:after="0" w:afterAutospacing="1"/>
         <w:ind w:left="720" w:hanging="360"/>
+        <w:jc w:val="both"/>
         <w:rPr>
           <w:rFonts w:hint="default" w:ascii="Times New Roman" w:hAnsi="Times New Roman" w:cs="Times New Roman"/>
           <w:sz w:val="20"/>
@@ -2400,6 +2442,7 @@
         <w:suppressLineNumbers w:val="0"/>
         <w:spacing w:before="0" w:beforeAutospacing="1" w:after="0" w:afterAutospacing="1"/>
         <w:ind w:left="720" w:hanging="360"/>
+        <w:jc w:val="both"/>
         <w:rPr>
           <w:rFonts w:hint="default" w:ascii="Times New Roman" w:hAnsi="Times New Roman" w:eastAsia="CMU Serif Roman" w:cs="Times New Roman"/>
         </w:rPr>
@@ -2495,6 +2538,7 @@
         <w:widowControl/>
         <w:suppressLineNumbers w:val="0"/>
         <w:ind w:firstLine="720" w:firstLineChars="0"/>
+        <w:jc w:val="both"/>
         <w:rPr>
           <w:rFonts w:hint="default" w:ascii="Times New Roman" w:hAnsi="Times New Roman" w:cs="Times New Roman"/>
           <w:sz w:val="20"/>
@@ -2540,7 +2584,6 @@
           <w:lang w:val="en-US"/>
         </w:rPr>
         <w:tab/>
-        <w:t/>
       </w:r>
       <w:r>
         <w:rPr>
@@ -2567,7 +2610,6 @@
           <w:lang w:val="en-US"/>
         </w:rPr>
         <w:tab/>
-        <w:t/>
       </w:r>
       <w:r>
         <w:rPr>
@@ -2594,6 +2636,7 @@
         <w:widowControl/>
         <w:suppressLineNumbers w:val="0"/>
         <w:ind w:firstLine="720" w:firstLineChars="0"/>
+        <w:jc w:val="both"/>
         <w:rPr>
           <w:rFonts w:hint="default" w:ascii="Times New Roman" w:hAnsi="Times New Roman" w:cs="Times New Roman"/>
           <w:sz w:val="20"/>
@@ -2658,7 +2701,6 @@
           <w:lang w:val="en-US"/>
         </w:rPr>
         <w:tab/>
-        <w:t/>
       </w:r>
       <w:r>
         <w:rPr>
@@ -2685,7 +2727,6 @@
           <w:lang w:val="en-US"/>
         </w:rPr>
         <w:tab/>
-        <w:t/>
       </w:r>
       <w:r>
         <w:rPr>
@@ -2712,6 +2753,7 @@
         <w:widowControl/>
         <w:suppressLineNumbers w:val="0"/>
         <w:ind w:firstLine="720" w:firstLineChars="0"/>
+        <w:jc w:val="both"/>
         <w:rPr>
           <w:rFonts w:hint="default" w:ascii="Times New Roman" w:hAnsi="Times New Roman" w:eastAsia="CMU Serif Roman" w:cs="Times New Roman"/>
           <w:b/>
@@ -2758,7 +2800,6 @@
           <w:lang w:val="en-US"/>
         </w:rPr>
         <w:tab/>
-        <w:t/>
       </w:r>
       <w:r>
         <w:rPr>
@@ -2802,7 +2843,6 @@
           <w:lang w:val="en-US"/>
         </w:rPr>
         <w:tab/>
-        <w:t/>
       </w:r>
       <w:r>
         <w:rPr>
@@ -2829,7 +2869,6 @@
           <w:lang w:val="en-US"/>
         </w:rPr>
         <w:tab/>
-        <w:t/>
       </w:r>
       <w:r>
         <w:rPr>
@@ -2902,6 +2941,7 @@
       <w:pPr>
         <w:spacing w:after="0"/>
         <w:ind w:firstLine="360"/>
+        <w:jc w:val="both"/>
         <w:rPr>
           <w:rFonts w:hint="default" w:ascii="Times New Roman" w:hAnsi="Times New Roman" w:eastAsia="Times New Roman" w:cs="Times New Roman"/>
         </w:rPr>
@@ -2911,6 +2951,7 @@
       <w:pPr>
         <w:spacing w:after="0"/>
         <w:ind w:firstLine="360"/>
+        <w:jc w:val="both"/>
         <w:rPr>
           <w:rFonts w:hint="default" w:ascii="Times New Roman" w:hAnsi="Times New Roman" w:eastAsia="Times New Roman" w:cs="Times New Roman"/>
         </w:rPr>
@@ -2920,6 +2961,7 @@
       <w:pPr>
         <w:spacing w:after="0"/>
         <w:ind w:firstLine="360"/>
+        <w:jc w:val="both"/>
         <w:rPr>
           <w:rFonts w:hint="default" w:ascii="Times New Roman" w:hAnsi="Times New Roman" w:eastAsia="Times New Roman" w:cs="Times New Roman"/>
         </w:rPr>
@@ -2929,6 +2971,7 @@
       <w:pPr>
         <w:spacing w:after="0"/>
         <w:ind w:firstLine="360"/>
+        <w:jc w:val="both"/>
         <w:rPr>
           <w:rFonts w:hint="default" w:ascii="Times New Roman" w:hAnsi="Times New Roman" w:eastAsia="Times New Roman" w:cs="Times New Roman"/>
           <w:sz w:val="22"/>
@@ -2977,6 +3020,7 @@
         </w:tabs>
         <w:spacing w:before="0" w:beforeAutospacing="1" w:after="0" w:afterAutospacing="1"/>
         <w:ind w:left="1140" w:leftChars="0" w:hanging="360"/>
+        <w:jc w:val="both"/>
         <w:rPr>
           <w:rFonts w:hint="default" w:ascii="Times New Roman" w:hAnsi="Times New Roman" w:cs="Times New Roman"/>
           <w:sz w:val="20"/>
@@ -3008,6 +3052,7 @@
         </w:tabs>
         <w:spacing w:before="0" w:beforeAutospacing="1" w:after="0" w:afterAutospacing="1"/>
         <w:ind w:left="1140" w:leftChars="0" w:hanging="360"/>
+        <w:jc w:val="both"/>
         <w:rPr>
           <w:rFonts w:hint="default" w:ascii="Times New Roman" w:hAnsi="Times New Roman" w:cs="Times New Roman"/>
           <w:sz w:val="20"/>
@@ -3039,6 +3084,7 @@
         </w:tabs>
         <w:spacing w:before="0" w:beforeAutospacing="1" w:after="0" w:afterAutospacing="1"/>
         <w:ind w:left="1140" w:leftChars="0" w:hanging="360"/>
+        <w:jc w:val="both"/>
         <w:rPr>
           <w:rFonts w:hint="default" w:ascii="Times New Roman" w:hAnsi="Times New Roman" w:cs="Times New Roman"/>
           <w:sz w:val="20"/>
@@ -3070,6 +3116,7 @@
         </w:tabs>
         <w:spacing w:before="0" w:beforeAutospacing="1" w:after="0" w:afterAutospacing="1"/>
         <w:ind w:left="1140" w:leftChars="0" w:hanging="360"/>
+        <w:jc w:val="both"/>
         <w:rPr>
           <w:rFonts w:hint="default" w:ascii="Times New Roman" w:hAnsi="Times New Roman" w:cs="Times New Roman"/>
           <w:sz w:val="20"/>
@@ -3091,6 +3138,7 @@
         <w:keepLines w:val="0"/>
         <w:widowControl/>
         <w:numPr>
+          <w:ilvl w:val="0"/>
           <w:numId w:val="0"/>
         </w:numPr>
         <w:suppressLineNumbers w:val="0"/>
@@ -3098,6 +3146,7 @@
           <w:tab w:val="left" w:pos="720"/>
         </w:tabs>
         <w:spacing w:before="0" w:beforeAutospacing="1" w:after="0" w:afterAutospacing="1"/>
+        <w:jc w:val="both"/>
         <w:rPr>
           <w:rFonts w:hint="default" w:ascii="Times New Roman" w:hAnsi="Times New Roman" w:cs="Times New Roman"/>
           <w:lang w:val="en-US"/>
@@ -3126,6 +3175,7 @@
         <w:keepLines w:val="0"/>
         <w:widowControl/>
         <w:numPr>
+          <w:ilvl w:val="0"/>
           <w:numId w:val="0"/>
         </w:numPr>
         <w:suppressLineNumbers w:val="0"/>
@@ -3134,6 +3184,7 @@
         </w:tabs>
         <w:spacing w:before="0" w:beforeAutospacing="1" w:after="0" w:afterAutospacing="1"/>
         <w:ind w:left="780" w:leftChars="0"/>
+        <w:jc w:val="both"/>
         <w:rPr>
           <w:rFonts w:hint="default" w:ascii="Times New Roman" w:hAnsi="Times New Roman" w:cs="Times New Roman"/>
           <w:sz w:val="20"/>
@@ -3152,6 +3203,7 @@
     <w:p>
       <w:pPr>
         <w:spacing w:after="0"/>
+        <w:jc w:val="both"/>
         <w:rPr>
           <w:rFonts w:hint="default" w:ascii="Times New Roman" w:hAnsi="Times New Roman" w:eastAsia="Times New Roman" w:cs="Times New Roman"/>
           <w:lang w:val="en-US"/>
@@ -3162,6 +3214,7 @@
       <w:pPr>
         <w:spacing w:after="0"/>
         <w:ind w:firstLine="360"/>
+        <w:jc w:val="both"/>
         <w:rPr>
           <w:rFonts w:hint="default" w:ascii="Times New Roman" w:hAnsi="Times New Roman" w:eastAsia="Times New Roman" w:cs="Times New Roman"/>
         </w:rPr>
@@ -3177,6 +3230,7 @@
       <w:pPr>
         <w:spacing w:after="0"/>
         <w:ind w:firstLine="360"/>
+        <w:jc w:val="both"/>
         <w:rPr>
           <w:rFonts w:hint="default" w:ascii="Times New Roman" w:hAnsi="Times New Roman" w:eastAsia="Times New Roman" w:cs="Times New Roman"/>
         </w:rPr>
@@ -3186,6 +3240,7 @@
       <w:pPr>
         <w:spacing w:after="0"/>
         <w:ind w:firstLine="360"/>
+        <w:jc w:val="both"/>
         <w:rPr>
           <w:rFonts w:hint="default" w:ascii="Times New Roman" w:hAnsi="Times New Roman" w:eastAsia="Times New Roman" w:cs="Times New Roman"/>
         </w:rPr>
@@ -3195,6 +3250,7 @@
       <w:pPr>
         <w:spacing w:after="0"/>
         <w:ind w:firstLine="360"/>
+        <w:jc w:val="both"/>
         <w:rPr>
           <w:rFonts w:hint="default" w:ascii="Times New Roman" w:hAnsi="Times New Roman" w:eastAsia="Times New Roman" w:cs="Times New Roman"/>
         </w:rPr>
@@ -3204,6 +3260,7 @@
       <w:pPr>
         <w:spacing w:after="0"/>
         <w:ind w:firstLine="360"/>
+        <w:jc w:val="both"/>
         <w:rPr>
           <w:rFonts w:hint="default" w:ascii="Times New Roman" w:hAnsi="Times New Roman" w:eastAsia="Times New Roman" w:cs="Times New Roman"/>
         </w:rPr>
@@ -3224,6 +3281,7 @@
         <w:suppressLineNumbers w:val="0"/>
         <w:spacing w:before="0" w:beforeAutospacing="1" w:after="0" w:afterAutospacing="1"/>
         <w:ind w:left="0" w:right="0"/>
+        <w:jc w:val="both"/>
         <w:rPr>
           <w:rFonts w:hint="default" w:ascii="Times New Roman" w:hAnsi="Times New Roman" w:cs="Times New Roman"/>
           <w:sz w:val="22"/>
@@ -3255,6 +3313,7 @@
         </w:tabs>
         <w:spacing w:before="0" w:beforeAutospacing="1" w:after="0" w:afterAutospacing="1"/>
         <w:ind w:left="780" w:leftChars="0"/>
+        <w:jc w:val="both"/>
         <w:rPr>
           <w:rFonts w:hint="default" w:ascii="Times New Roman" w:hAnsi="Times New Roman" w:cs="Times New Roman"/>
         </w:rPr>
@@ -3281,6 +3340,7 @@
         </w:tabs>
         <w:spacing w:before="0" w:beforeAutospacing="1" w:after="0" w:afterAutospacing="1"/>
         <w:ind w:left="780" w:leftChars="0" w:firstLine="0" w:firstLineChars="0"/>
+        <w:jc w:val="both"/>
         <w:rPr>
           <w:rFonts w:hint="default" w:ascii="Times New Roman" w:hAnsi="Times New Roman" w:cs="Times New Roman"/>
         </w:rPr>
@@ -3307,6 +3367,7 @@
         </w:tabs>
         <w:spacing w:before="0" w:beforeAutospacing="1" w:after="0" w:afterAutospacing="1"/>
         <w:ind w:left="780" w:leftChars="0" w:firstLine="0" w:firstLineChars="0"/>
+        <w:jc w:val="both"/>
         <w:rPr>
           <w:rFonts w:hint="default" w:ascii="Times New Roman" w:hAnsi="Times New Roman" w:cs="Times New Roman"/>
         </w:rPr>
@@ -3333,6 +3394,7 @@
         </w:tabs>
         <w:spacing w:before="0" w:beforeAutospacing="1" w:after="0" w:afterAutospacing="1"/>
         <w:ind w:left="780" w:leftChars="0" w:firstLine="0" w:firstLineChars="0"/>
+        <w:jc w:val="both"/>
         <w:rPr>
           <w:rFonts w:hint="default" w:ascii="Times New Roman" w:hAnsi="Times New Roman" w:cs="Times New Roman"/>
         </w:rPr>
@@ -3350,6 +3412,7 @@
         <w:keepLines w:val="0"/>
         <w:widowControl/>
         <w:numPr>
+          <w:ilvl w:val="0"/>
           <w:numId w:val="0"/>
         </w:numPr>
         <w:suppressLineNumbers w:val="0"/>
@@ -3357,6 +3420,7 @@
           <w:tab w:val="left" w:pos="720"/>
         </w:tabs>
         <w:spacing w:before="0" w:beforeAutospacing="1" w:after="0" w:afterAutospacing="1"/>
+        <w:jc w:val="both"/>
         <w:rPr>
           <w:rFonts w:hint="default" w:ascii="Times New Roman" w:hAnsi="Times New Roman" w:cs="Times New Roman"/>
           <w:lang w:val="en-US"/>
@@ -3380,6 +3444,7 @@
         <w:keepLines w:val="0"/>
         <w:widowControl/>
         <w:numPr>
+          <w:ilvl w:val="0"/>
           <w:numId w:val="0"/>
         </w:numPr>
         <w:suppressLineNumbers w:val="0"/>
@@ -3388,6 +3453,7 @@
         </w:tabs>
         <w:spacing w:before="0" w:beforeAutospacing="1" w:after="0" w:afterAutospacing="1"/>
         <w:ind w:left="780" w:leftChars="0"/>
+        <w:jc w:val="both"/>
         <w:rPr>
           <w:rFonts w:hint="default" w:ascii="Times New Roman" w:hAnsi="Times New Roman" w:cs="Times New Roman"/>
         </w:rPr>
@@ -3410,6 +3476,7 @@
         </w:pBdr>
         <w:spacing w:after="0" w:line="276" w:lineRule="auto"/>
         <w:ind w:left="360"/>
+        <w:jc w:val="both"/>
         <w:rPr>
           <w:rFonts w:hint="default" w:ascii="Times New Roman" w:hAnsi="Times New Roman" w:eastAsia="CMU Serif Roman" w:cs="Times New Roman"/>
           <w:color w:val="000000"/>
@@ -3428,6 +3495,7 @@
           <w:between w:val="none" w:color="auto" w:sz="0" w:space="0"/>
         </w:pBdr>
         <w:spacing w:after="0" w:line="276" w:lineRule="auto"/>
+        <w:jc w:val="both"/>
         <w:rPr>
           <w:rFonts w:hint="default" w:ascii="Times New Roman" w:hAnsi="Times New Roman" w:eastAsia="CMU Serif Roman" w:cs="Times New Roman"/>
           <w:color w:val="000000"/>
@@ -3446,6 +3514,7 @@
           <w:between w:val="none" w:color="auto" w:sz="0" w:space="0"/>
         </w:pBdr>
         <w:spacing w:line="276" w:lineRule="auto"/>
+        <w:jc w:val="both"/>
         <w:rPr>
           <w:rFonts w:hint="default" w:ascii="Times New Roman" w:hAnsi="Times New Roman" w:eastAsia="CMU Serif Roman" w:cs="Times New Roman"/>
           <w:color w:val="000000"/>
@@ -3464,6 +3533,7 @@
           <w:between w:val="none" w:color="auto" w:sz="0" w:space="0"/>
         </w:pBdr>
         <w:spacing w:after="0" w:line="360" w:lineRule="auto"/>
+        <w:jc w:val="both"/>
         <w:rPr>
           <w:rFonts w:hint="default" w:ascii="Times New Roman" w:hAnsi="Times New Roman" w:eastAsia="Times New Roman" w:cs="Times New Roman"/>
         </w:rPr>
@@ -4436,7 +4506,7 @@
     <w:lsdException w:unhideWhenUsed="0" w:uiPriority="62" w:semiHidden="0" w:name="Light Grid Accent 1"/>
     <w:lsdException w:unhideWhenUsed="0" w:uiPriority="63" w:semiHidden="0" w:name="Medium Shading 1 Accent 1"/>
     <w:lsdException w:unhideWhenUsed="0" w:uiPriority="64" w:semiHidden="0" w:name="Medium Shading 2 Accent 1"/>
-    <w:lsdException w:unhideWhenUsed="0" w:uiPriority="65" w:semiHidden="0" w:name="Medium List 1 Accent 1"/>
+    <w:lsdException w:qFormat="1" w:unhideWhenUsed="0" w:uiPriority="65" w:semiHidden="0" w:name="Medium List 1 Accent 1"/>
     <w:lsdException w:qFormat="1" w:unhideWhenUsed="0" w:uiPriority="34" w:semiHidden="0" w:name="List Paragraph"/>
     <w:lsdException w:unhideWhenUsed="0" w:uiPriority="66" w:semiHidden="0" w:name="Medium List 2 Accent 1"/>
     <w:lsdException w:unhideWhenUsed="0" w:uiPriority="67" w:semiHidden="0" w:name="Medium Grid 1 Accent 1"/>
@@ -4457,7 +4527,7 @@
     <w:lsdException w:unhideWhenUsed="0" w:uiPriority="68" w:semiHidden="0" w:name="Medium Grid 2 Accent 2"/>
     <w:lsdException w:unhideWhenUsed="0" w:uiPriority="69" w:semiHidden="0" w:name="Medium Grid 3 Accent 2"/>
     <w:lsdException w:unhideWhenUsed="0" w:uiPriority="70" w:semiHidden="0" w:name="Dark List Accent 2"/>
-    <w:lsdException w:qFormat="1" w:unhideWhenUsed="0" w:uiPriority="71" w:semiHidden="0" w:name="Colorful Shading Accent 2"/>
+    <w:lsdException w:unhideWhenUsed="0" w:uiPriority="71" w:semiHidden="0" w:name="Colorful Shading Accent 2"/>
     <w:lsdException w:unhideWhenUsed="0" w:uiPriority="72" w:semiHidden="0" w:name="Colorful List Accent 2"/>
     <w:lsdException w:unhideWhenUsed="0" w:uiPriority="73" w:semiHidden="0" w:name="Colorful Grid Accent 2"/>
     <w:lsdException w:unhideWhenUsed="0" w:uiPriority="60" w:semiHidden="0" w:name="Light Shading Accent 3"/>

</xml_diff>